<commit_message>
Indirect Model Insights — fix model count, drop hover-preview reference, align metric names
- Tab 4 description corrected: 8 indirect models (not 9). The 9th ranking
  indicator, Salary by Profession, is a deterministic cohort ratio rather
  than a learned model and is not represented here.
- Removed the "hover any card" instruction — every feature's % contribution
  is now listed inline beneath each card; there is no popover.
- Reading-the-metrics footnote relabelled to match the actual card chips:
  CV R² → Cross-val fit, Holdout R² → Next-year fit, MAE → Avg error,
  Rows → Trained on.
- Same fixes propagated to docs/user-guide.{md,docx}, docs/technical-docs.{md,docx}.

Co-Authored-By: Claude Opus 4.7 (1M context) <noreply@anthropic.com>
</commit_message>
<xml_diff>
--- a/docs/technical-docs.docx
+++ b/docs/technical-docs.docx
@@ -399,7 +399,7 @@
         <w:rPr>
           <w:rStyle w:val="VerbatimChar"/>
         </w:rPr>
-        <w:t xml:space="preserve">│   ├── explainability.js            # Tab 4 CFM cards + hover popover</w:t>
+        <w:t xml:space="preserve">│   ├── explainability.js            # Tab 4 — 8 CFM cards with inline % contribution lists</w:t>
       </w:r>
       <w:r>
         <w:br/>
@@ -9028,7 +9028,23 @@
               <w:pStyle w:val="Compact"/>
             </w:pPr>
             <w:r>
-              <w:t xml:space="preserve">Tab 4. Renders nine CFM cards with confidence pills + top-coefficient bar charts + adaptive hover popovers (positions next to the hovered card with viewport collision detection).</w:t>
+              <w:t xml:space="preserve">Tab 4. Renders</w:t>
+            </w:r>
+            <w:r>
+              <w:t xml:space="preserve"> </w:t>
+            </w:r>
+            <w:r>
+              <w:rPr>
+                <w:b/>
+                <w:bCs/>
+              </w:rPr>
+              <w:t xml:space="preserve">eight</w:t>
+            </w:r>
+            <w:r>
+              <w:t xml:space="preserve"> </w:t>
+            </w:r>
+            <w:r>
+              <w:t xml:space="preserve">CFM cards (one per indicator that has a learned model; Salary by Profession is deterministic and not modelled here) with confidence pills, top-coefficient bar charts, and an inline list of every feature’s % contribution sorted descending.</w:t>
             </w:r>
           </w:p>
         </w:tc>

</xml_diff>